<commit_message>
keywords: replace with the six supplied terms
Large Language Models (LLMs), LLM Reliability, Prompt Sensitivity, Credit Risk Assessment,
Model Risk Management, Specification-Curve Analysis.

Updated in the manuscript and in .zenodo.json. CITATION.cff and README.md carry no keyword
list. manuscript_round1_baseline.tex is deliberately unchanged: it is the baseline the
tracked-changes copies diff against, so editing it would hide the change from reviewers.
manuscript_anonymous.tex is derived and regenerates.

Verified as rendered in all eight deliverables rather than in the source: all six terms appear
in the pdf and the docx of each of the four manuscript variants.
</commit_message>
<xml_diff>
--- a/paper/manuscript_anonymous_tracked.docx
+++ b/paper/manuscript_anonymous_tracked.docx
@@ -146,15 +146,6 @@
       </w:pPr>
       <w:r>
         <w:rPr>
-          <w:strike/>
-        </w:rPr>
-        <w:t xml:space="preserve">Score validated on held-out specs (ROC-AUC 0.94) gives a candidate operational model-risk control.</w:t>
-      </w:r>
-      <w:r>
-        <w:t xml:space="preserve"> </w:t>
-      </w:r>
-      <w:r>
-        <w:rPr>
           <w:highlight w:val="yellow"/>
         </w:rPr>
         <w:t xml:space="preserve">At the binary IG/HY gate, a dispersion index predicts held-out instability (ROC-AUC 0.94) but is ordinally equivalent to dissent count, so it is reported descriptively.</w:t>
@@ -201,7 +192,85 @@
         <w:pStyle w:val="FirstParagraph"/>
       </w:pPr>
       <w:r>
-        <w:t xml:space="preserve">large language models · credit ratings · specification-curve analysis · model risk · reproducibility · investment grade</w:t>
+        <w:rPr>
+          <w:highlight w:val="yellow"/>
+        </w:rPr>
+        <w:t xml:space="preserve">Large Language Models (LLMs)</w:t>
+      </w:r>
+      <w:r>
+        <w:t xml:space="preserve"> </w:t>
+      </w:r>
+      <w:r>
+        <w:t xml:space="preserve">·</w:t>
+      </w:r>
+      <w:r>
+        <w:t xml:space="preserve"> </w:t>
+      </w:r>
+      <w:r>
+        <w:rPr>
+          <w:highlight w:val="yellow"/>
+        </w:rPr>
+        <w:t xml:space="preserve">LLM Reliability</w:t>
+      </w:r>
+      <w:r>
+        <w:t xml:space="preserve"> </w:t>
+      </w:r>
+      <w:r>
+        <w:t xml:space="preserve">·</w:t>
+      </w:r>
+      <w:r>
+        <w:t xml:space="preserve"> </w:t>
+      </w:r>
+      <w:r>
+        <w:rPr>
+          <w:highlight w:val="yellow"/>
+        </w:rPr>
+        <w:t xml:space="preserve">Prompt Sensitivity</w:t>
+      </w:r>
+      <w:r>
+        <w:t xml:space="preserve"> </w:t>
+      </w:r>
+      <w:r>
+        <w:t xml:space="preserve">·</w:t>
+      </w:r>
+      <w:r>
+        <w:t xml:space="preserve"> </w:t>
+      </w:r>
+      <w:r>
+        <w:rPr>
+          <w:highlight w:val="yellow"/>
+        </w:rPr>
+        <w:t xml:space="preserve">Credit Risk Assessment</w:t>
+      </w:r>
+      <w:r>
+        <w:t xml:space="preserve"> </w:t>
+      </w:r>
+      <w:r>
+        <w:t xml:space="preserve">·</w:t>
+      </w:r>
+      <w:r>
+        <w:t xml:space="preserve"> </w:t>
+      </w:r>
+      <w:r>
+        <w:rPr>
+          <w:highlight w:val="yellow"/>
+        </w:rPr>
+        <w:t xml:space="preserve">Model Risk Management</w:t>
+      </w:r>
+      <w:r>
+        <w:t xml:space="preserve"> </w:t>
+      </w:r>
+      <w:r>
+        <w:t xml:space="preserve">·</w:t>
+      </w:r>
+      <w:r>
+        <w:t xml:space="preserve"> </w:t>
+      </w:r>
+      <w:r>
+        <w:rPr>
+          <w:highlight w:val="yellow"/>
+        </w:rPr>
+        <w:t xml:space="preserve">Specification-Curve Analysis</w:t>
       </w:r>
     </w:p>
     <w:bookmarkEnd w:id="11"/>

</xml_diff>